<commit_message>
Testphase 30 Tage und MWST-Hinweis in der Registrierung
Der Preisentscheid vom 16.08.2026 war im Code erst zur Hälfte umgesetzt:
die Staffel stimmte, der Registrierungsablauf nicht.

- Registrierungsformular: "inkl. MWST" -> "exkl. MWST" (zwei Stellen),
  Testphase 14 -> 30 Tage (Ankreuzfeld, Erläuterung, Knopfbeschriftung)
- registrierung.ts: trial_period_days 14 -> 30
- Flyer: alte Staffel "CHF 7.- bis 9.-" -> "CHF 11.- bis 15.-", exkl.
  MWST, 30 Tage
- Projektdokumentation: Testphase 30 Tage; die Behauptung "bis zu 3
  Benutzer" entfernt, die nie umgesetzt war (der Checkout bucht immer
  die gewaehlte Menge)
- releases.json: Eintrag zur laengeren Testphase

Offen und bewusst nicht angefasst: die Betraege in Stripe selbst
(STRIPE_PRICE_*), die Modulpreise im Checkout und der
Einfuehrungsrabatt - das gehoert zum Schritt "Stripe live".

Co-Authored-By: Claude Opus 5 <noreply@anthropic.com>
</commit_message>
<xml_diff>
--- a/docs/ArcoTime-Flyer.docx
+++ b/docs/ArcoTime-Flyer.docx
@@ -414,7 +414,7 @@
           <w:sz w:val="26"/>
           <w:szCs w:val="26"/>
         </w:rPr>
-        <w:t xml:space="preserve">  Ab CHF 7.– bis CHF 9.– pro Monat und Benutzer  </w:t>
+        <w:t xml:space="preserve">  Ab CHF 11.– bis CHF 15.– pro Monat und Benutzer  </w:t>
       </w:r>
     </w:p>
     <w:p>
@@ -435,7 +435,7 @@
           <w:sz w:val="19"/>
           <w:szCs w:val="19"/>
         </w:rPr>
-        <w:t xml:space="preserve">  gestaffelt nach Anzahl Lizenzen  ·  14 Tage kostenlos testen  </w:t>
+        <w:t xml:space="preserve">  gestaffelt nach Anzahl Lizenzen, exkl. MWST  ·  30 Tage kostenlos testen  </w:t>
       </w:r>
     </w:p>
     <w:p>
@@ -709,7 +709,7 @@
           <w:sz w:val="19"/>
           <w:szCs w:val="19"/>
         </w:rPr>
-        <w:t xml:space="preserve">Oder direkt online registrieren und 14 Tage kostenlos testen: </w:t>
+        <w:t xml:space="preserve">Oder direkt online registrieren und 30 Tage kostenlos testen: </w:t>
       </w:r>
       <w:r>
         <w:rPr>

</xml_diff>